<commit_message>
MIG: fix multilingual filled CSV export
</commit_message>
<xml_diff>
--- a/sablony/BARVA dlouhy popis en.docx
+++ b/sablony/BARVA dlouhy popis en.docx
@@ -9,7 +9,6 @@
       <w:r>
         <w:rPr>
           <w:rtl w:val="0"/>
-          <w:lang w:val="en-US"/>
         </w:rPr>
         <w:t>&lt;!-- ===================== UNIVERSAL PRODUCT TEMPLATE ===================== --&gt;</w:t>
       </w:r>
@@ -21,7 +20,6 @@
       <w:r>
         <w:rPr>
           <w:rtl w:val="0"/>
-          <w:lang w:val="en-US"/>
         </w:rPr>
         <w:t>&lt;style&gt;&lt;!--</w:t>
       </w:r>
@@ -33,7 +31,6 @@
       <w:r>
         <w:rPr>
           <w:rtl w:val="0"/>
-          <w:lang w:val="en-US"/>
         </w:rPr>
         <w:t>body {</w:t>
       </w:r>
@@ -41,14 +38,10 @@
     <w:p>
       <w:pPr>
         <w:pStyle w:val="Text A"/>
-        <w:rPr>
-          <w:lang w:val="nl-NL"/>
-        </w:rPr>
-      </w:pPr>
-      <w:r>
-        <w:rPr>
-          <w:rtl w:val="0"/>
-          <w:lang w:val="nl-NL"/>
+      </w:pPr>
+      <w:r>
+        <w:rPr>
+          <w:rtl w:val="0"/>
         </w:rPr>
         <w:t xml:space="preserve">  font-family: 'Inter', 'Helvetica Neue', sans-serif;</w:t>
       </w:r>
@@ -60,7 +53,6 @@
       <w:r>
         <w:rPr>
           <w:rtl w:val="0"/>
-          <w:lang w:val="en-US"/>
         </w:rPr>
         <w:t xml:space="preserve">  background-color: #fff;</w:t>
       </w:r>
@@ -72,7 +64,6 @@
       <w:r>
         <w:rPr>
           <w:rtl w:val="0"/>
-          <w:lang w:val="en-US"/>
         </w:rPr>
         <w:t xml:space="preserve">  color: #333;</w:t>
       </w:r>
@@ -84,7 +75,6 @@
       <w:r>
         <w:rPr>
           <w:rtl w:val="0"/>
-          <w:lang w:val="en-US"/>
         </w:rPr>
         <w:t xml:space="preserve">  line-height: 1.5;</w:t>
       </w:r>
@@ -96,7 +86,6 @@
       <w:r>
         <w:rPr>
           <w:rtl w:val="0"/>
-          <w:lang w:val="en-US"/>
         </w:rPr>
         <w:t xml:space="preserve">  margin: 0;</w:t>
       </w:r>
@@ -108,7 +97,6 @@
       <w:r>
         <w:rPr>
           <w:rtl w:val="0"/>
-          <w:lang w:val="en-US"/>
         </w:rPr>
         <w:t xml:space="preserve">  padding: 0;</w:t>
       </w:r>
@@ -120,7 +108,6 @@
       <w:r>
         <w:rPr>
           <w:rtl w:val="0"/>
-          <w:lang w:val="en-US"/>
         </w:rPr>
         <w:t>}</w:t>
       </w:r>
@@ -137,7 +124,6 @@
       <w:r>
         <w:rPr>
           <w:rtl w:val="0"/>
-          <w:lang w:val="en-US"/>
         </w:rPr>
         <w:t>h1, h2, h3 {</w:t>
       </w:r>
@@ -149,7 +135,6 @@
       <w:r>
         <w:rPr>
           <w:rtl w:val="0"/>
-          <w:lang w:val="en-US"/>
         </w:rPr>
         <w:t xml:space="preserve">  color: #004466;</w:t>
       </w:r>
@@ -161,7 +146,6 @@
       <w:r>
         <w:rPr>
           <w:rtl w:val="0"/>
-          <w:lang w:val="en-US"/>
         </w:rPr>
         <w:t xml:space="preserve">  font-weight: 700;</w:t>
       </w:r>
@@ -173,7 +157,6 @@
       <w:r>
         <w:rPr>
           <w:rtl w:val="0"/>
-          <w:lang w:val="en-US"/>
         </w:rPr>
         <w:t xml:space="preserve">  margin-top: 0;</w:t>
       </w:r>
@@ -181,14 +164,10 @@
     <w:p>
       <w:pPr>
         <w:pStyle w:val="Text A"/>
-        <w:rPr>
-          <w:lang w:val="it-IT"/>
-        </w:rPr>
-      </w:pPr>
-      <w:r>
-        <w:rPr>
-          <w:rtl w:val="0"/>
-          <w:lang w:val="it-IT"/>
+      </w:pPr>
+      <w:r>
+        <w:rPr>
+          <w:rtl w:val="0"/>
         </w:rPr>
         <w:t xml:space="preserve">  margin-bottom: 12px;</w:t>
       </w:r>
@@ -200,7 +179,6 @@
       <w:r>
         <w:rPr>
           <w:rtl w:val="0"/>
-          <w:lang w:val="en-US"/>
         </w:rPr>
         <w:t>}</w:t>
       </w:r>
@@ -213,14 +191,10 @@
     <w:p>
       <w:pPr>
         <w:pStyle w:val="Text A"/>
-        <w:rPr>
-          <w:lang w:val="ru-RU"/>
-        </w:rPr>
-      </w:pPr>
-      <w:r>
-        <w:rPr>
-          <w:rtl w:val="0"/>
-          <w:lang w:val="ru-RU"/>
+      </w:pPr>
+      <w:r>
+        <w:rPr>
+          <w:rtl w:val="0"/>
         </w:rPr>
         <w:t>h1 {</w:t>
       </w:r>
@@ -232,7 +206,6 @@
       <w:r>
         <w:rPr>
           <w:rtl w:val="0"/>
-          <w:lang w:val="en-US"/>
         </w:rPr>
         <w:t xml:space="preserve">  font-size: 36px;</w:t>
       </w:r>
@@ -244,7 +217,6 @@
       <w:r>
         <w:rPr>
           <w:rtl w:val="0"/>
-          <w:lang w:val="en-US"/>
         </w:rPr>
         <w:t xml:space="preserve">  text-align: center;</w:t>
       </w:r>
@@ -256,7 +228,6 @@
       <w:r>
         <w:rPr>
           <w:rtl w:val="0"/>
-          <w:lang w:val="en-US"/>
         </w:rPr>
         <w:t xml:space="preserve">  margin-top: 40px;</w:t>
       </w:r>
@@ -264,14 +235,10 @@
     <w:p>
       <w:pPr>
         <w:pStyle w:val="Text A"/>
-        <w:rPr>
-          <w:lang w:val="it-IT"/>
-        </w:rPr>
-      </w:pPr>
-      <w:r>
-        <w:rPr>
-          <w:rtl w:val="0"/>
-          <w:lang w:val="it-IT"/>
+      </w:pPr>
+      <w:r>
+        <w:rPr>
+          <w:rtl w:val="0"/>
         </w:rPr>
         <w:t xml:space="preserve">  margin-bottom: 16px;</w:t>
       </w:r>
@@ -283,7 +250,6 @@
       <w:r>
         <w:rPr>
           <w:rtl w:val="0"/>
-          <w:lang w:val="en-US"/>
         </w:rPr>
         <w:t>}</w:t>
       </w:r>
@@ -300,7 +266,6 @@
       <w:r>
         <w:rPr>
           <w:rtl w:val="0"/>
-          <w:lang w:val="en-US"/>
         </w:rPr>
         <w:t>h2 {</w:t>
       </w:r>
@@ -312,7 +277,6 @@
       <w:r>
         <w:rPr>
           <w:rtl w:val="0"/>
-          <w:lang w:val="en-US"/>
         </w:rPr>
         <w:t xml:space="preserve">  font-size: 22px;</w:t>
       </w:r>
@@ -324,7 +288,6 @@
       <w:r>
         <w:rPr>
           <w:rtl w:val="0"/>
-          <w:lang w:val="en-US"/>
         </w:rPr>
         <w:t xml:space="preserve">  margin-top: 32px;</w:t>
       </w:r>
@@ -332,14 +295,10 @@
     <w:p>
       <w:pPr>
         <w:pStyle w:val="Text A"/>
-        <w:rPr>
-          <w:lang w:val="it-IT"/>
-        </w:rPr>
-      </w:pPr>
-      <w:r>
-        <w:rPr>
-          <w:rtl w:val="0"/>
-          <w:lang w:val="it-IT"/>
+      </w:pPr>
+      <w:r>
+        <w:rPr>
+          <w:rtl w:val="0"/>
         </w:rPr>
         <w:t xml:space="preserve">  margin-bottom: 10px;</w:t>
       </w:r>
@@ -351,7 +310,6 @@
       <w:r>
         <w:rPr>
           <w:rtl w:val="0"/>
-          <w:lang w:val="en-US"/>
         </w:rPr>
         <w:t>}</w:t>
       </w:r>
@@ -368,7 +326,6 @@
       <w:r>
         <w:rPr>
           <w:rtl w:val="0"/>
-          <w:lang w:val="en-US"/>
         </w:rPr>
         <w:t>h3 {</w:t>
       </w:r>
@@ -380,7 +337,6 @@
       <w:r>
         <w:rPr>
           <w:rtl w:val="0"/>
-          <w:lang w:val="en-US"/>
         </w:rPr>
         <w:t xml:space="preserve">  font-size: 18px;</w:t>
       </w:r>
@@ -388,14 +344,10 @@
     <w:p>
       <w:pPr>
         <w:pStyle w:val="Text A"/>
-        <w:rPr>
-          <w:lang w:val="it-IT"/>
-        </w:rPr>
-      </w:pPr>
-      <w:r>
-        <w:rPr>
-          <w:rtl w:val="0"/>
-          <w:lang w:val="it-IT"/>
+      </w:pPr>
+      <w:r>
+        <w:rPr>
+          <w:rtl w:val="0"/>
         </w:rPr>
         <w:t xml:space="preserve">  margin-top: 24px;</w:t>
       </w:r>
@@ -403,14 +355,10 @@
     <w:p>
       <w:pPr>
         <w:pStyle w:val="Text A"/>
-        <w:rPr>
-          <w:lang w:val="it-IT"/>
-        </w:rPr>
-      </w:pPr>
-      <w:r>
-        <w:rPr>
-          <w:rtl w:val="0"/>
-          <w:lang w:val="it-IT"/>
+      </w:pPr>
+      <w:r>
+        <w:rPr>
+          <w:rtl w:val="0"/>
         </w:rPr>
         <w:t xml:space="preserve">  margin-bottom: 8px;</w:t>
       </w:r>
@@ -422,7 +370,6 @@
       <w:r>
         <w:rPr>
           <w:rtl w:val="0"/>
-          <w:lang w:val="en-US"/>
         </w:rPr>
         <w:t>}</w:t>
       </w:r>
@@ -435,14 +382,10 @@
     <w:p>
       <w:pPr>
         <w:pStyle w:val="Text A"/>
-        <w:rPr>
-          <w:lang w:val="fr-FR"/>
-        </w:rPr>
-      </w:pPr>
-      <w:r>
-        <w:rPr>
-          <w:rtl w:val="0"/>
-          <w:lang w:val="fr-FR"/>
+      </w:pPr>
+      <w:r>
+        <w:rPr>
+          <w:rtl w:val="0"/>
         </w:rPr>
         <w:t>.section {</w:t>
       </w:r>
@@ -450,14 +393,10 @@
     <w:p>
       <w:pPr>
         <w:pStyle w:val="Text A"/>
-        <w:rPr>
-          <w:lang w:val="de-DE"/>
-        </w:rPr>
-      </w:pPr>
-      <w:r>
-        <w:rPr>
-          <w:rtl w:val="0"/>
-          <w:lang w:val="de-DE"/>
+      </w:pPr>
+      <w:r>
+        <w:rPr>
+          <w:rtl w:val="0"/>
         </w:rPr>
         <w:t xml:space="preserve">  max-width: 1000px;</w:t>
       </w:r>
@@ -469,7 +408,6 @@
       <w:r>
         <w:rPr>
           <w:rtl w:val="0"/>
-          <w:lang w:val="en-US"/>
         </w:rPr>
         <w:t xml:space="preserve">  margin: 0 auto;</w:t>
       </w:r>
@@ -481,7 +419,6 @@
       <w:r>
         <w:rPr>
           <w:rtl w:val="0"/>
-          <w:lang w:val="en-US"/>
         </w:rPr>
         <w:t xml:space="preserve">  padding: 30px 20px;</w:t>
       </w:r>
@@ -493,7 +430,6 @@
       <w:r>
         <w:rPr>
           <w:rtl w:val="0"/>
-          <w:lang w:val="en-US"/>
         </w:rPr>
         <w:t>}</w:t>
       </w:r>
@@ -506,14 +442,10 @@
     <w:p>
       <w:pPr>
         <w:pStyle w:val="Text A"/>
-        <w:rPr>
-          <w:lang w:val="it-IT"/>
-        </w:rPr>
-      </w:pPr>
-      <w:r>
-        <w:rPr>
-          <w:rtl w:val="0"/>
-          <w:lang w:val="it-IT"/>
+      </w:pPr>
+      <w:r>
+        <w:rPr>
+          <w:rtl w:val="0"/>
         </w:rPr>
         <w:t>.hero {</w:t>
       </w:r>
@@ -525,7 +457,6 @@
       <w:r>
         <w:rPr>
           <w:rtl w:val="0"/>
-          <w:lang w:val="en-US"/>
         </w:rPr>
         <w:t xml:space="preserve">  text-align: center;</w:t>
       </w:r>
@@ -537,7 +468,6 @@
       <w:r>
         <w:rPr>
           <w:rtl w:val="0"/>
-          <w:lang w:val="en-US"/>
         </w:rPr>
         <w:t xml:space="preserve">  padding: 60px 20px 30px;</w:t>
       </w:r>
@@ -549,7 +479,6 @@
       <w:r>
         <w:rPr>
           <w:rtl w:val="0"/>
-          <w:lang w:val="en-US"/>
         </w:rPr>
         <w:t>}</w:t>
       </w:r>
@@ -562,14 +491,10 @@
     <w:p>
       <w:pPr>
         <w:pStyle w:val="Text A"/>
-        <w:rPr>
-          <w:lang w:val="it-IT"/>
-        </w:rPr>
-      </w:pPr>
-      <w:r>
-        <w:rPr>
-          <w:rtl w:val="0"/>
-          <w:lang w:val="it-IT"/>
+      </w:pPr>
+      <w:r>
+        <w:rPr>
+          <w:rtl w:val="0"/>
         </w:rPr>
         <w:t>.hero p {</w:t>
       </w:r>
@@ -581,7 +506,6 @@
       <w:r>
         <w:rPr>
           <w:rtl w:val="0"/>
-          <w:lang w:val="en-US"/>
         </w:rPr>
         <w:t xml:space="preserve">  font-size: 17px;</w:t>
       </w:r>
@@ -593,7 +517,6 @@
       <w:r>
         <w:rPr>
           <w:rtl w:val="0"/>
-          <w:lang w:val="en-US"/>
         </w:rPr>
         <w:t xml:space="preserve">  color: #555;</w:t>
       </w:r>
@@ -601,14 +524,10 @@
     <w:p>
       <w:pPr>
         <w:pStyle w:val="Text A"/>
-        <w:rPr>
-          <w:lang w:val="de-DE"/>
-        </w:rPr>
-      </w:pPr>
-      <w:r>
-        <w:rPr>
-          <w:rtl w:val="0"/>
-          <w:lang w:val="de-DE"/>
+      </w:pPr>
+      <w:r>
+        <w:rPr>
+          <w:rtl w:val="0"/>
         </w:rPr>
         <w:t xml:space="preserve">  max-width: 700px;</w:t>
       </w:r>
@@ -620,7 +539,6 @@
       <w:r>
         <w:rPr>
           <w:rtl w:val="0"/>
-          <w:lang w:val="en-US"/>
         </w:rPr>
         <w:t xml:space="preserve">  margin: 0 auto;</w:t>
       </w:r>
@@ -632,7 +550,6 @@
       <w:r>
         <w:rPr>
           <w:rtl w:val="0"/>
-          <w:lang w:val="en-US"/>
         </w:rPr>
         <w:t>}</w:t>
       </w:r>
@@ -649,7 +566,6 @@
       <w:r>
         <w:rPr>
           <w:rtl w:val="0"/>
-          <w:lang w:val="en-US"/>
         </w:rPr>
         <w:t>.flex-row {</w:t>
       </w:r>
@@ -657,14 +573,10 @@
     <w:p>
       <w:pPr>
         <w:pStyle w:val="Text A"/>
-        <w:rPr>
-          <w:lang w:val="it-IT"/>
-        </w:rPr>
-      </w:pPr>
-      <w:r>
-        <w:rPr>
-          <w:rtl w:val="0"/>
-          <w:lang w:val="it-IT"/>
+      </w:pPr>
+      <w:r>
+        <w:rPr>
+          <w:rtl w:val="0"/>
         </w:rPr>
         <w:t xml:space="preserve">  display: flex;</w:t>
       </w:r>
@@ -676,7 +588,6 @@
       <w:r>
         <w:rPr>
           <w:rtl w:val="0"/>
-          <w:lang w:val="en-US"/>
         </w:rPr>
         <w:t xml:space="preserve">  flex-wrap: wrap;</w:t>
       </w:r>
@@ -688,7 +599,6 @@
       <w:r>
         <w:rPr>
           <w:rtl w:val="0"/>
-          <w:lang w:val="en-US"/>
         </w:rPr>
         <w:t xml:space="preserve">  gap: 20px;</w:t>
       </w:r>
@@ -700,7 +610,6 @@
       <w:r>
         <w:rPr>
           <w:rtl w:val="0"/>
-          <w:lang w:val="en-US"/>
         </w:rPr>
         <w:t xml:space="preserve">  align-items: center;</w:t>
       </w:r>
@@ -712,7 +621,6 @@
       <w:r>
         <w:rPr>
           <w:rtl w:val="0"/>
-          <w:lang w:val="en-US"/>
         </w:rPr>
         <w:t xml:space="preserve">  justify-content: center;</w:t>
       </w:r>
@@ -720,14 +628,10 @@
     <w:p>
       <w:pPr>
         <w:pStyle w:val="Text A"/>
-        <w:rPr>
-          <w:lang w:val="it-IT"/>
-        </w:rPr>
-      </w:pPr>
-      <w:r>
-        <w:rPr>
-          <w:rtl w:val="0"/>
-          <w:lang w:val="it-IT"/>
+      </w:pPr>
+      <w:r>
+        <w:rPr>
+          <w:rtl w:val="0"/>
         </w:rPr>
         <w:t xml:space="preserve">  margin-top: 20px;</w:t>
       </w:r>
@@ -739,7 +643,6 @@
       <w:r>
         <w:rPr>
           <w:rtl w:val="0"/>
-          <w:lang w:val="en-US"/>
         </w:rPr>
         <w:t>}</w:t>
       </w:r>
@@ -756,7 +659,6 @@
       <w:r>
         <w:rPr>
           <w:rtl w:val="0"/>
-          <w:lang w:val="en-US"/>
         </w:rPr>
         <w:t>.flex-row img {</w:t>
       </w:r>
@@ -764,14 +666,10 @@
     <w:p>
       <w:pPr>
         <w:pStyle w:val="Text A"/>
-        <w:rPr>
-          <w:lang w:val="de-DE"/>
-        </w:rPr>
-      </w:pPr>
-      <w:r>
-        <w:rPr>
-          <w:rtl w:val="0"/>
-          <w:lang w:val="de-DE"/>
+      </w:pPr>
+      <w:r>
+        <w:rPr>
+          <w:rtl w:val="0"/>
         </w:rPr>
         <w:t xml:space="preserve">  max-width: 250px;</w:t>
       </w:r>
@@ -779,14 +677,10 @@
     <w:p>
       <w:pPr>
         <w:pStyle w:val="Text A"/>
-        <w:rPr>
-          <w:lang w:val="de-DE"/>
-        </w:rPr>
-      </w:pPr>
-      <w:r>
-        <w:rPr>
-          <w:rtl w:val="0"/>
-          <w:lang w:val="de-DE"/>
+      </w:pPr>
+      <w:r>
+        <w:rPr>
+          <w:rtl w:val="0"/>
         </w:rPr>
         <w:t xml:space="preserve">  border-radius: 16px;</w:t>
       </w:r>
@@ -798,7 +692,6 @@
       <w:r>
         <w:rPr>
           <w:rtl w:val="0"/>
-          <w:lang w:val="en-US"/>
         </w:rPr>
         <w:t xml:space="preserve">  box-shadow: 0 8px 24px rgba(0,0,0,0.08);</w:t>
       </w:r>
@@ -810,7 +703,6 @@
       <w:r>
         <w:rPr>
           <w:rtl w:val="0"/>
-          <w:lang w:val="en-US"/>
         </w:rPr>
         <w:t xml:space="preserve">  transition: transform 0.3s ease;</w:t>
       </w:r>
@@ -822,7 +714,6 @@
       <w:r>
         <w:rPr>
           <w:rtl w:val="0"/>
-          <w:lang w:val="en-US"/>
         </w:rPr>
         <w:t>}</w:t>
       </w:r>
@@ -839,7 +730,6 @@
       <w:r>
         <w:rPr>
           <w:rtl w:val="0"/>
-          <w:lang w:val="en-US"/>
         </w:rPr>
         <w:t>.flex-row img:hover {</w:t>
       </w:r>
@@ -847,14 +737,10 @@
     <w:p>
       <w:pPr>
         <w:pStyle w:val="Text A"/>
-        <w:rPr>
-          <w:lang w:val="it-IT"/>
-        </w:rPr>
-      </w:pPr>
-      <w:r>
-        <w:rPr>
-          <w:rtl w:val="0"/>
-          <w:lang w:val="it-IT"/>
+      </w:pPr>
+      <w:r>
+        <w:rPr>
+          <w:rtl w:val="0"/>
         </w:rPr>
         <w:t xml:space="preserve">  transform: scale(1.03);</w:t>
       </w:r>
@@ -866,7 +752,6 @@
       <w:r>
         <w:rPr>
           <w:rtl w:val="0"/>
-          <w:lang w:val="en-US"/>
         </w:rPr>
         <w:t>}</w:t>
       </w:r>
@@ -883,7 +768,6 @@
       <w:r>
         <w:rPr>
           <w:rtl w:val="0"/>
-          <w:lang w:val="en-US"/>
         </w:rPr>
         <w:t>.text-block {</w:t>
       </w:r>
@@ -895,7 +779,6 @@
       <w:r>
         <w:rPr>
           <w:rtl w:val="0"/>
-          <w:lang w:val="en-US"/>
         </w:rPr>
         <w:t xml:space="preserve">  font-size: 16px;</w:t>
       </w:r>
@@ -907,7 +790,6 @@
       <w:r>
         <w:rPr>
           <w:rtl w:val="0"/>
-          <w:lang w:val="en-US"/>
         </w:rPr>
         <w:t xml:space="preserve">  color: #555;</w:t>
       </w:r>
@@ -919,7 +801,6 @@
       <w:r>
         <w:rPr>
           <w:rtl w:val="0"/>
-          <w:lang w:val="en-US"/>
         </w:rPr>
         <w:t xml:space="preserve">  line-height: 1.6;</w:t>
       </w:r>
@@ -931,7 +812,6 @@
       <w:r>
         <w:rPr>
           <w:rtl w:val="0"/>
-          <w:lang w:val="en-US"/>
         </w:rPr>
         <w:t xml:space="preserve">  margin-top: 12px;</w:t>
       </w:r>
@@ -943,7 +823,6 @@
       <w:r>
         <w:rPr>
           <w:rtl w:val="0"/>
-          <w:lang w:val="en-US"/>
         </w:rPr>
         <w:t>}</w:t>
       </w:r>
@@ -960,7 +839,6 @@
       <w:r>
         <w:rPr>
           <w:rtl w:val="0"/>
-          <w:lang w:val="en-US"/>
         </w:rPr>
         <w:t>.card-table {</w:t>
       </w:r>
@@ -972,7 +850,6 @@
       <w:r>
         <w:rPr>
           <w:rtl w:val="0"/>
-          <w:lang w:val="en-US"/>
         </w:rPr>
         <w:t xml:space="preserve">  background: #fff;</w:t>
       </w:r>
@@ -980,14 +857,10 @@
     <w:p>
       <w:pPr>
         <w:pStyle w:val="Text A"/>
-        <w:rPr>
-          <w:lang w:val="de-DE"/>
-        </w:rPr>
-      </w:pPr>
-      <w:r>
-        <w:rPr>
-          <w:rtl w:val="0"/>
-          <w:lang w:val="de-DE"/>
+      </w:pPr>
+      <w:r>
+        <w:rPr>
+          <w:rtl w:val="0"/>
         </w:rPr>
         <w:t xml:space="preserve">  border-radius: 16px;</w:t>
       </w:r>
@@ -999,7 +872,6 @@
       <w:r>
         <w:rPr>
           <w:rtl w:val="0"/>
-          <w:lang w:val="en-US"/>
         </w:rPr>
         <w:t xml:space="preserve">  box-shadow: 0 8px 24px rgba(0,0,0,0.06);</w:t>
       </w:r>
@@ -1011,7 +883,6 @@
       <w:r>
         <w:rPr>
           <w:rtl w:val="0"/>
-          <w:lang w:val="en-US"/>
         </w:rPr>
         <w:t xml:space="preserve">  padding: 16px;</w:t>
       </w:r>
@@ -1023,7 +894,6 @@
       <w:r>
         <w:rPr>
           <w:rtl w:val="0"/>
-          <w:lang w:val="en-US"/>
         </w:rPr>
         <w:t xml:space="preserve">  margin-top: 16px;</w:t>
       </w:r>
@@ -1035,7 +905,6 @@
       <w:r>
         <w:rPr>
           <w:rtl w:val="0"/>
-          <w:lang w:val="en-US"/>
         </w:rPr>
         <w:t>}</w:t>
       </w:r>
@@ -1052,7 +921,6 @@
       <w:r>
         <w:rPr>
           <w:rtl w:val="0"/>
-          <w:lang w:val="en-US"/>
         </w:rPr>
         <w:t>.card-table table {</w:t>
       </w:r>
@@ -1060,14 +928,10 @@
     <w:p>
       <w:pPr>
         <w:pStyle w:val="Text A"/>
-        <w:rPr>
-          <w:lang w:val="de-DE"/>
-        </w:rPr>
-      </w:pPr>
-      <w:r>
-        <w:rPr>
-          <w:rtl w:val="0"/>
-          <w:lang w:val="de-DE"/>
+      </w:pPr>
+      <w:r>
+        <w:rPr>
+          <w:rtl w:val="0"/>
         </w:rPr>
         <w:t xml:space="preserve">  width: 100%;</w:t>
       </w:r>
@@ -1079,7 +943,6 @@
       <w:r>
         <w:rPr>
           <w:rtl w:val="0"/>
-          <w:lang w:val="en-US"/>
         </w:rPr>
         <w:t xml:space="preserve">  border-collapse: collapse;</w:t>
       </w:r>
@@ -1091,7 +954,6 @@
       <w:r>
         <w:rPr>
           <w:rtl w:val="0"/>
-          <w:lang w:val="en-US"/>
         </w:rPr>
         <w:t xml:space="preserve">  font-size: 15px;</w:t>
       </w:r>
@@ -1103,7 +965,6 @@
       <w:r>
         <w:rPr>
           <w:rtl w:val="0"/>
-          <w:lang w:val="en-US"/>
         </w:rPr>
         <w:t>}</w:t>
       </w:r>
@@ -1120,7 +981,6 @@
       <w:r>
         <w:rPr>
           <w:rtl w:val="0"/>
-          <w:lang w:val="en-US"/>
         </w:rPr>
         <w:t>.card-table th, .card-table td {</w:t>
       </w:r>
@@ -1132,7 +992,6 @@
       <w:r>
         <w:rPr>
           <w:rtl w:val="0"/>
-          <w:lang w:val="en-US"/>
         </w:rPr>
         <w:t xml:space="preserve">  padding: 10px;</w:t>
       </w:r>
@@ -1144,7 +1003,6 @@
       <w:r>
         <w:rPr>
           <w:rtl w:val="0"/>
-          <w:lang w:val="en-US"/>
         </w:rPr>
         <w:t xml:space="preserve">  text-align: left;</w:t>
       </w:r>
@@ -1156,7 +1014,6 @@
       <w:r>
         <w:rPr>
           <w:rtl w:val="0"/>
-          <w:lang w:val="en-US"/>
         </w:rPr>
         <w:t>}</w:t>
       </w:r>
@@ -1173,7 +1030,6 @@
       <w:r>
         <w:rPr>
           <w:rtl w:val="0"/>
-          <w:lang w:val="en-US"/>
         </w:rPr>
         <w:t>.card-table th {</w:t>
       </w:r>
@@ -1185,7 +1041,6 @@
       <w:r>
         <w:rPr>
           <w:rtl w:val="0"/>
-          <w:lang w:val="en-US"/>
         </w:rPr>
         <w:t xml:space="preserve">  background-color: #f0f0f0;</w:t>
       </w:r>
@@ -1197,7 +1052,6 @@
       <w:r>
         <w:rPr>
           <w:rtl w:val="0"/>
-          <w:lang w:val="en-US"/>
         </w:rPr>
         <w:t xml:space="preserve">  border-bottom: 1px solid #ddd;</w:t>
       </w:r>
@@ -1209,7 +1063,6 @@
       <w:r>
         <w:rPr>
           <w:rtl w:val="0"/>
-          <w:lang w:val="en-US"/>
         </w:rPr>
         <w:t>}</w:t>
       </w:r>
@@ -1226,7 +1079,6 @@
       <w:r>
         <w:rPr>
           <w:rtl w:val="0"/>
-          <w:lang w:val="en-US"/>
         </w:rPr>
         <w:t>.card-table td {</w:t>
       </w:r>
@@ -1238,7 +1090,6 @@
       <w:r>
         <w:rPr>
           <w:rtl w:val="0"/>
-          <w:lang w:val="en-US"/>
         </w:rPr>
         <w:t xml:space="preserve">  border-bottom: 1px solid #eee;</w:t>
       </w:r>
@@ -1250,7 +1101,6 @@
       <w:r>
         <w:rPr>
           <w:rtl w:val="0"/>
-          <w:lang w:val="en-US"/>
         </w:rPr>
         <w:t>}</w:t>
       </w:r>
@@ -1267,7 +1117,6 @@
       <w:r>
         <w:rPr>
           <w:rtl w:val="0"/>
-          <w:lang w:val="en-US"/>
         </w:rPr>
         <w:t>ul {</w:t>
       </w:r>
@@ -1279,7 +1128,6 @@
       <w:r>
         <w:rPr>
           <w:rtl w:val="0"/>
-          <w:lang w:val="en-US"/>
         </w:rPr>
         <w:t xml:space="preserve">  padding-left: 20px;</w:t>
       </w:r>
@@ -1291,7 +1139,6 @@
       <w:r>
         <w:rPr>
           <w:rtl w:val="0"/>
-          <w:lang w:val="en-US"/>
         </w:rPr>
         <w:t xml:space="preserve">  line-height: 1.5;</w:t>
       </w:r>
@@ -1303,7 +1150,6 @@
       <w:r>
         <w:rPr>
           <w:rtl w:val="0"/>
-          <w:lang w:val="en-US"/>
         </w:rPr>
         <w:t xml:space="preserve">  margin: 8px 0;</w:t>
       </w:r>
@@ -1315,7 +1161,6 @@
       <w:r>
         <w:rPr>
           <w:rtl w:val="0"/>
-          <w:lang w:val="en-US"/>
         </w:rPr>
         <w:t>}</w:t>
       </w:r>
@@ -1323,14 +1168,10 @@
     <w:p>
       <w:pPr>
         <w:pStyle w:val="Text A"/>
-        <w:rPr>
-          <w:lang w:val="fr-FR"/>
-        </w:rPr>
-      </w:pPr>
-      <w:r>
-        <w:rPr>
-          <w:rtl w:val="0"/>
-          <w:lang w:val="fr-FR"/>
+      </w:pPr>
+      <w:r>
+        <w:rPr>
+          <w:rtl w:val="0"/>
         </w:rPr>
         <w:t>.section ul,</w:t>
       </w:r>
@@ -1342,7 +1183,6 @@
       <w:r>
         <w:rPr>
           <w:rtl w:val="0"/>
-          <w:lang w:val="en-US"/>
         </w:rPr>
         <w:t>.section li {</w:t>
       </w:r>
@@ -1354,7 +1194,6 @@
       <w:r>
         <w:rPr>
           <w:rtl w:val="0"/>
-          <w:lang w:val="en-US"/>
         </w:rPr>
         <w:t xml:space="preserve">  font-size: 16px;</w:t>
       </w:r>
@@ -1366,7 +1205,6 @@
       <w:r>
         <w:rPr>
           <w:rtl w:val="0"/>
-          <w:lang w:val="en-US"/>
         </w:rPr>
         <w:t xml:space="preserve">  color: #555;</w:t>
       </w:r>
@@ -1378,7 +1216,6 @@
       <w:r>
         <w:rPr>
           <w:rtl w:val="0"/>
-          <w:lang w:val="en-US"/>
         </w:rPr>
         <w:t xml:space="preserve">  line-height: 1.6;</w:t>
       </w:r>
@@ -1390,7 +1227,6 @@
       <w:r>
         <w:rPr>
           <w:rtl w:val="0"/>
-          <w:lang w:val="en-US"/>
         </w:rPr>
         <w:t>}</w:t>
       </w:r>
@@ -1407,7 +1243,6 @@
       <w:r>
         <w:rPr>
           <w:rtl w:val="0"/>
-          <w:lang w:val="en-US"/>
         </w:rPr>
         <w:t>.video-block {</w:t>
       </w:r>
@@ -1419,7 +1254,6 @@
       <w:r>
         <w:rPr>
           <w:rtl w:val="0"/>
-          <w:lang w:val="en-US"/>
         </w:rPr>
         <w:t xml:space="preserve">  position: relative;</w:t>
       </w:r>
@@ -1427,14 +1261,10 @@
     <w:p>
       <w:pPr>
         <w:pStyle w:val="Text A"/>
-        <w:rPr>
-          <w:lang w:val="it-IT"/>
-        </w:rPr>
-      </w:pPr>
-      <w:r>
-        <w:rPr>
-          <w:rtl w:val="0"/>
-          <w:lang w:val="it-IT"/>
+      </w:pPr>
+      <w:r>
+        <w:rPr>
+          <w:rtl w:val="0"/>
         </w:rPr>
         <w:t xml:space="preserve">  padding-bottom: 56.25%;</w:t>
       </w:r>
@@ -1446,7 +1276,6 @@
       <w:r>
         <w:rPr>
           <w:rtl w:val="0"/>
-          <w:lang w:val="en-US"/>
         </w:rPr>
         <w:t xml:space="preserve">  height: 0;</w:t>
       </w:r>
@@ -1458,7 +1287,6 @@
       <w:r>
         <w:rPr>
           <w:rtl w:val="0"/>
-          <w:lang w:val="en-US"/>
         </w:rPr>
         <w:t xml:space="preserve">  overflow: hidden;</w:t>
       </w:r>
@@ -1466,14 +1294,10 @@
     <w:p>
       <w:pPr>
         <w:pStyle w:val="Text A"/>
-        <w:rPr>
-          <w:lang w:val="de-DE"/>
-        </w:rPr>
-      </w:pPr>
-      <w:r>
-        <w:rPr>
-          <w:rtl w:val="0"/>
-          <w:lang w:val="de-DE"/>
+      </w:pPr>
+      <w:r>
+        <w:rPr>
+          <w:rtl w:val="0"/>
         </w:rPr>
         <w:t xml:space="preserve">  border-radius: 16px;</w:t>
       </w:r>
@@ -1481,14 +1305,10 @@
     <w:p>
       <w:pPr>
         <w:pStyle w:val="Text A"/>
-        <w:rPr>
-          <w:lang w:val="it-IT"/>
-        </w:rPr>
-      </w:pPr>
-      <w:r>
-        <w:rPr>
-          <w:rtl w:val="0"/>
-          <w:lang w:val="it-IT"/>
+      </w:pPr>
+      <w:r>
+        <w:rPr>
+          <w:rtl w:val="0"/>
         </w:rPr>
         <w:t xml:space="preserve">  margin-top: 24px;</w:t>
       </w:r>
@@ -1500,7 +1320,6 @@
       <w:r>
         <w:rPr>
           <w:rtl w:val="0"/>
-          <w:lang w:val="en-US"/>
         </w:rPr>
         <w:t>}</w:t>
       </w:r>
@@ -1513,14 +1332,10 @@
     <w:p>
       <w:pPr>
         <w:pStyle w:val="Text A"/>
-        <w:rPr>
-          <w:lang w:val="sv-SE"/>
-        </w:rPr>
-      </w:pPr>
-      <w:r>
-        <w:rPr>
-          <w:rtl w:val="0"/>
-          <w:lang w:val="sv-SE"/>
+      </w:pPr>
+      <w:r>
+        <w:rPr>
+          <w:rtl w:val="0"/>
         </w:rPr>
         <w:t>.video-block iframe {</w:t>
       </w:r>
@@ -1528,14 +1343,10 @@
     <w:p>
       <w:pPr>
         <w:pStyle w:val="Text A"/>
-        <w:rPr>
-          <w:lang w:val="it-IT"/>
-        </w:rPr>
-      </w:pPr>
-      <w:r>
-        <w:rPr>
-          <w:rtl w:val="0"/>
-          <w:lang w:val="it-IT"/>
+      </w:pPr>
+      <w:r>
+        <w:rPr>
+          <w:rtl w:val="0"/>
         </w:rPr>
         <w:t xml:space="preserve">  position: absolute;</w:t>
       </w:r>
@@ -1547,7 +1358,6 @@
       <w:r>
         <w:rPr>
           <w:rtl w:val="0"/>
-          <w:lang w:val="en-US"/>
         </w:rPr>
         <w:t xml:space="preserve">  top: 0;</w:t>
       </w:r>
@@ -1559,7 +1369,6 @@
       <w:r>
         <w:rPr>
           <w:rtl w:val="0"/>
-          <w:lang w:val="en-US"/>
         </w:rPr>
         <w:t xml:space="preserve">  left: 0;</w:t>
       </w:r>
@@ -1567,14 +1376,10 @@
     <w:p>
       <w:pPr>
         <w:pStyle w:val="Text A"/>
-        <w:rPr>
-          <w:lang w:val="de-DE"/>
-        </w:rPr>
-      </w:pPr>
-      <w:r>
-        <w:rPr>
-          <w:rtl w:val="0"/>
-          <w:lang w:val="de-DE"/>
+      </w:pPr>
+      <w:r>
+        <w:rPr>
+          <w:rtl w:val="0"/>
         </w:rPr>
         <w:t xml:space="preserve">  width: 100%;</w:t>
       </w:r>
@@ -1586,7 +1391,6 @@
       <w:r>
         <w:rPr>
           <w:rtl w:val="0"/>
-          <w:lang w:val="en-US"/>
         </w:rPr>
         <w:t xml:space="preserve">  height: 100%;</w:t>
       </w:r>
@@ -1594,14 +1398,10 @@
     <w:p>
       <w:pPr>
         <w:pStyle w:val="Text A"/>
-        <w:rPr>
-          <w:lang w:val="de-DE"/>
-        </w:rPr>
-      </w:pPr>
-      <w:r>
-        <w:rPr>
-          <w:rtl w:val="0"/>
-          <w:lang w:val="de-DE"/>
+      </w:pPr>
+      <w:r>
+        <w:rPr>
+          <w:rtl w:val="0"/>
         </w:rPr>
         <w:t xml:space="preserve">  border-radius: 16px;</w:t>
       </w:r>
@@ -1613,7 +1413,6 @@
       <w:r>
         <w:rPr>
           <w:rtl w:val="0"/>
-          <w:lang w:val="en-US"/>
         </w:rPr>
         <w:t>}</w:t>
       </w:r>
@@ -1626,14 +1425,10 @@
     <w:p>
       <w:pPr>
         <w:pStyle w:val="Text A"/>
-        <w:rPr>
-          <w:lang w:val="de-DE"/>
-        </w:rPr>
-      </w:pPr>
-      <w:r>
-        <w:rPr>
-          <w:rtl w:val="0"/>
-          <w:lang w:val="de-DE"/>
+      </w:pPr>
+      <w:r>
+        <w:rPr>
+          <w:rtl w:val="0"/>
         </w:rPr>
         <w:t>hr {</w:t>
       </w:r>
@@ -1645,7 +1440,6 @@
       <w:r>
         <w:rPr>
           <w:rtl w:val="0"/>
-          <w:lang w:val="en-US"/>
         </w:rPr>
         <w:t xml:space="preserve">  border: none;</w:t>
       </w:r>
@@ -1657,7 +1451,6 @@
       <w:r>
         <w:rPr>
           <w:rtl w:val="0"/>
-          <w:lang w:val="en-US"/>
         </w:rPr>
         <w:t xml:space="preserve">  height: 1px;</w:t>
       </w:r>
@@ -1669,7 +1462,6 @@
       <w:r>
         <w:rPr>
           <w:rtl w:val="0"/>
-          <w:lang w:val="en-US"/>
         </w:rPr>
         <w:t xml:space="preserve">  background: linear-gradient(to right, transparent, #ccc, transparent);</w:t>
       </w:r>
@@ -1681,7 +1473,6 @@
       <w:r>
         <w:rPr>
           <w:rtl w:val="0"/>
-          <w:lang w:val="en-US"/>
         </w:rPr>
         <w:t xml:space="preserve">  margin: 40px 0;</w:t>
       </w:r>
@@ -1693,7 +1484,6 @@
       <w:r>
         <w:rPr>
           <w:rtl w:val="0"/>
-          <w:lang w:val="en-US"/>
         </w:rPr>
         <w:t>}</w:t>
       </w:r>
@@ -1705,7 +1495,6 @@
       <w:r>
         <w:rPr>
           <w:rtl w:val="0"/>
-          <w:lang w:val="en-US"/>
         </w:rPr>
         <w:t>--&gt;&lt;/style&gt;</w:t>
       </w:r>
@@ -1722,7 +1511,6 @@
       <w:r>
         <w:rPr>
           <w:rtl w:val="0"/>
-          <w:lang w:val="en-US"/>
         </w:rPr>
         <w:t>&lt;!-- ===================== UNIVERSAL PRODUCT TEMPLATE ===================== --&gt;</w:t>
       </w:r>
@@ -1735,14 +1523,10 @@
     <w:p>
       <w:pPr>
         <w:pStyle w:val="Text A"/>
-        <w:rPr>
-          <w:lang w:val="de-DE"/>
-        </w:rPr>
-      </w:pPr>
-      <w:r>
-        <w:rPr>
-          <w:rtl w:val="0"/>
-          <w:lang w:val="de-DE"/>
+      </w:pPr>
+      <w:r>
+        <w:rPr>
+          <w:rtl w:val="0"/>
         </w:rPr>
         <w:t>&lt;!-- HERO --&gt;</w:t>
       </w:r>
@@ -1754,7 +1538,6 @@
       <w:r>
         <w:rPr>
           <w:rtl w:val="0"/>
-          <w:lang w:val="en-US"/>
         </w:rPr>
         <w:t>&lt;div class="hero"&gt;</w:t>
       </w:r>
@@ -1766,7 +1549,6 @@
       <w:r>
         <w:rPr>
           <w:rtl w:val="0"/>
-          <w:lang w:val="en-US"/>
         </w:rPr>
         <w:t>&lt;h1&gt;{nazev_produktu}&lt;/h1&gt;</w:t>
       </w:r>
@@ -1778,7 +1560,6 @@
       <w:r>
         <w:rPr>
           <w:rtl w:val="0"/>
-          <w:lang w:val="en-US"/>
         </w:rPr>
         <w:t>&lt;p&gt;{strucny_popis_produktu}&lt;/p&gt;</w:t>
       </w:r>
@@ -1790,7 +1571,6 @@
       <w:r>
         <w:rPr>
           <w:rtl w:val="0"/>
-          <w:lang w:val="en-US"/>
         </w:rPr>
         <w:t>&lt;/div&gt;</w:t>
       </w:r>
@@ -1807,7 +1587,6 @@
       <w:r>
         <w:rPr>
           <w:rtl w:val="0"/>
-          <w:lang w:val="en-US"/>
         </w:rPr>
         <w:t>&lt;!-- INTRO + IMAGE --&gt;</w:t>
       </w:r>
@@ -1819,7 +1598,6 @@
       <w:r>
         <w:rPr>
           <w:rtl w:val="0"/>
-          <w:lang w:val="en-US"/>
         </w:rPr>
         <w:t>&lt;div class="section flex-row"&gt;</w:t>
       </w:r>
@@ -1831,7 +1609,6 @@
       <w:r>
         <w:rPr>
           <w:rtl w:val="0"/>
-          <w:lang w:val="en-US"/>
         </w:rPr>
         <w:t>&lt;div style="flex: 1; min-width: 280px;"&gt;</w:t>
       </w:r>
@@ -1843,19 +1620,28 @@
       <w:r>
         <w:rPr>
           <w:rtl w:val="0"/>
-          <w:lang w:val="en-US"/>
-        </w:rPr>
-        <w:t>&lt;p&gt;&lt;strong&gt;{nazev_produktu}&lt;/strong&gt; is a {typ_produktu} suitable for &lt;em&gt;{doporucene_pouziti}&lt;/em&gt;. {hlavni_vlastnosti}.&lt;/p&gt;</w:t>
-      </w:r>
-    </w:p>
-    <w:p>
-      <w:pPr>
-        <w:pStyle w:val="Text A"/>
-      </w:pPr>
-      <w:r>
-        <w:rPr>
-          <w:rtl w:val="0"/>
-          <w:lang w:val="en-US"/>
+        </w:rPr>
+        <w:t>&lt;p&gt;&lt;strong&gt;{nazev_produktu}&lt;/strong&gt; is a {typ_produktu} suitable for &lt;em&gt;{doporucene_pouziti}&lt;/em&gt;. &lt;em&gt;{hlavni_vlastnosti}.&lt;/em&gt;</w:t>
+      </w:r>
+    </w:p>
+    <w:p>
+      <w:pPr>
+        <w:pStyle w:val="Text A"/>
+      </w:pPr>
+      <w:r>
+        <w:rPr>
+          <w:rtl w:val="0"/>
+        </w:rPr>
+        <w:t>&lt;em&gt;{konkretni_aplikace}.&lt;/em&gt;.&lt;/p&gt;</w:t>
+      </w:r>
+    </w:p>
+    <w:p>
+      <w:pPr>
+        <w:pStyle w:val="Text A"/>
+      </w:pPr>
+      <w:r>
+        <w:rPr>
+          <w:rtl w:val="0"/>
         </w:rPr>
         <w:t>&lt;/div&gt;</w:t>
       </w:r>
@@ -1867,32 +1653,17 @@
       <w:r>
         <w:rPr>
           <w:rtl w:val="0"/>
-          <w:lang w:val="en-US"/>
-        </w:rPr>
-        <w:t>&lt;img src="{</w:t>
-      </w:r>
-      <w:r>
-        <w:rPr>
-          <w:rtl w:val="0"/>
-        </w:rPr>
-        <w:t>img1_src</w:t>
-      </w:r>
-      <w:r>
-        <w:rPr>
-          <w:rtl w:val="0"/>
-          <w:lang w:val="en-US"/>
-        </w:rPr>
-        <w:t>}" alt="{nazev_produktu}" width="250" height="auto" /&gt;</w:t>
-      </w:r>
-    </w:p>
-    <w:p>
-      <w:pPr>
-        <w:pStyle w:val="Text A"/>
-      </w:pPr>
-      <w:r>
-        <w:rPr>
-          <w:rtl w:val="0"/>
-          <w:lang w:val="en-US"/>
+        </w:rPr>
+        <w:t>&lt;img src="{img1_src}" alt="{nazev_produktu}" width="250" height="auto" /&gt;</w:t>
+      </w:r>
+    </w:p>
+    <w:p>
+      <w:pPr>
+        <w:pStyle w:val="Text A"/>
+      </w:pPr>
+      <w:r>
+        <w:rPr>
+          <w:rtl w:val="0"/>
         </w:rPr>
         <w:t>&lt;/div&gt;</w:t>
       </w:r>
@@ -1906,15 +1677,9 @@
       <w:pPr>
         <w:pStyle w:val="Text A"/>
       </w:pPr>
-    </w:p>
-    <w:p>
-      <w:pPr>
-        <w:pStyle w:val="Text A"/>
-      </w:pPr>
-      <w:r>
-        <w:rPr>
-          <w:rtl w:val="0"/>
-          <w:lang w:val="en-US"/>
+      <w:r>
+        <w:rPr>
+          <w:rtl w:val="0"/>
         </w:rPr>
         <w:t>&lt;!-- ABOUT THE PRODUCT --&gt;</w:t>
       </w:r>
@@ -1926,7 +1691,6 @@
       <w:r>
         <w:rPr>
           <w:rtl w:val="0"/>
-          <w:lang w:val="en-US"/>
         </w:rPr>
         <w:t>&lt;div class="section"&gt;</w:t>
       </w:r>
@@ -1938,7 +1702,6 @@
       <w:r>
         <w:rPr>
           <w:rtl w:val="0"/>
-          <w:lang w:val="en-US"/>
         </w:rPr>
         <w:t>&lt;h2&gt;About the product&lt;/h2&gt;</w:t>
       </w:r>
@@ -1950,7 +1713,6 @@
       <w:r>
         <w:rPr>
           <w:rtl w:val="0"/>
-          <w:lang w:val="en-US"/>
         </w:rPr>
         <w:t>&lt;div class="text-block"&gt;</w:t>
       </w:r>
@@ -1962,7 +1724,6 @@
       <w:r>
         <w:rPr>
           <w:rtl w:val="0"/>
-          <w:lang w:val="en-US"/>
         </w:rPr>
         <w:t>&lt;p&gt;{podrobnejsi_popis_produktu}&lt;/p&gt;</w:t>
       </w:r>
@@ -1974,7 +1735,6 @@
       <w:r>
         <w:rPr>
           <w:rtl w:val="0"/>
-          <w:lang w:val="en-US"/>
         </w:rPr>
         <w:t>&lt;/div&gt;</w:t>
       </w:r>
@@ -1986,7 +1746,6 @@
       <w:r>
         <w:rPr>
           <w:rtl w:val="0"/>
-          <w:lang w:val="en-US"/>
         </w:rPr>
         <w:t>&lt;/div&gt;</w:t>
       </w:r>
@@ -2000,15 +1759,9 @@
       <w:pPr>
         <w:pStyle w:val="Text A"/>
       </w:pPr>
-    </w:p>
-    <w:p>
-      <w:pPr>
-        <w:pStyle w:val="Text A"/>
-      </w:pPr>
-      <w:r>
-        <w:rPr>
-          <w:rtl w:val="0"/>
-          <w:lang w:val="en-US"/>
+      <w:r>
+        <w:rPr>
+          <w:rtl w:val="0"/>
         </w:rPr>
         <w:t>&lt;!-- FEATURES --&gt;</w:t>
       </w:r>
@@ -2020,7 +1773,6 @@
       <w:r>
         <w:rPr>
           <w:rtl w:val="0"/>
-          <w:lang w:val="en-US"/>
         </w:rPr>
         <w:t>&lt;div class="section"&gt;</w:t>
       </w:r>
@@ -2032,7 +1784,6 @@
       <w:r>
         <w:rPr>
           <w:rtl w:val="0"/>
-          <w:lang w:val="en-US"/>
         </w:rPr>
         <w:t>&lt;h2&gt;Features&lt;/h2&gt;</w:t>
       </w:r>
@@ -2044,7 +1795,6 @@
       <w:r>
         <w:rPr>
           <w:rtl w:val="0"/>
-          <w:lang w:val="en-US"/>
         </w:rPr>
         <w:t>&lt;ul&gt;</w:t>
       </w:r>
@@ -2056,7 +1806,6 @@
       <w:r>
         <w:rPr>
           <w:rtl w:val="0"/>
-          <w:lang w:val="en-US"/>
         </w:rPr>
         <w:t>&lt;li&gt;{vlastnost_1}&lt;/li&gt;</w:t>
       </w:r>
@@ -2068,7 +1817,6 @@
       <w:r>
         <w:rPr>
           <w:rtl w:val="0"/>
-          <w:lang w:val="en-US"/>
         </w:rPr>
         <w:t>&lt;li&gt;{vlastnost_2}&lt;/li&gt;</w:t>
       </w:r>
@@ -2080,7 +1828,6 @@
       <w:r>
         <w:rPr>
           <w:rtl w:val="0"/>
-          <w:lang w:val="en-US"/>
         </w:rPr>
         <w:t>&lt;li&gt;{vlastnost_3}&lt;/li&gt;</w:t>
       </w:r>
@@ -2092,7 +1839,6 @@
       <w:r>
         <w:rPr>
           <w:rtl w:val="0"/>
-          <w:lang w:val="en-US"/>
         </w:rPr>
         <w:t>&lt;/ul&gt;</w:t>
       </w:r>
@@ -2104,7 +1850,6 @@
       <w:r>
         <w:rPr>
           <w:rtl w:val="0"/>
-          <w:lang w:val="en-US"/>
         </w:rPr>
         <w:t>&lt;/div&gt;</w:t>
       </w:r>
@@ -2117,26 +1862,21 @@
     <w:p>
       <w:pPr>
         <w:pStyle w:val="Text A"/>
-        <w:rPr>
-          <w:lang w:val="de-DE"/>
-        </w:rPr>
-      </w:pPr>
-      <w:r>
-        <w:rPr>
-          <w:rtl w:val="0"/>
-          <w:lang w:val="de-DE"/>
-        </w:rPr>
-        <w:t>&lt;!-- TECHNICAL PARAMETERS (ADDED FROM SHORT TEMPLATE) --&gt;</w:t>
-      </w:r>
-    </w:p>
-    <w:p>
-      <w:pPr>
-        <w:pStyle w:val="Text A"/>
-      </w:pPr>
-      <w:r>
-        <w:rPr>
-          <w:rtl w:val="0"/>
-          <w:lang w:val="en-US"/>
+      </w:pPr>
+      <w:r>
+        <w:rPr>
+          <w:rtl w:val="0"/>
+        </w:rPr>
+        <w:t>&lt;!-- TECHNICAL PARAMETERS --&gt;</w:t>
+      </w:r>
+    </w:p>
+    <w:p>
+      <w:pPr>
+        <w:pStyle w:val="Text A"/>
+      </w:pPr>
+      <w:r>
+        <w:rPr>
+          <w:rtl w:val="0"/>
         </w:rPr>
         <w:t>&lt;div class="section"&gt;</w:t>
       </w:r>
@@ -2148,7 +1888,6 @@
       <w:r>
         <w:rPr>
           <w:rtl w:val="0"/>
-          <w:lang w:val="en-US"/>
         </w:rPr>
         <w:t>&lt;h2&gt;Technical parameters&lt;/h2&gt;</w:t>
       </w:r>
@@ -2160,7 +1899,6 @@
       <w:r>
         <w:rPr>
           <w:rtl w:val="0"/>
-          <w:lang w:val="en-US"/>
         </w:rPr>
         <w:t>&lt;div class="card-table"&gt;</w:t>
       </w:r>
@@ -2172,7 +1910,6 @@
       <w:r>
         <w:rPr>
           <w:rtl w:val="0"/>
-          <w:lang w:val="en-US"/>
         </w:rPr>
         <w:t>&lt;table&gt;</w:t>
       </w:r>
@@ -2184,7 +1921,6 @@
       <w:r>
         <w:rPr>
           <w:rtl w:val="0"/>
-          <w:lang w:val="en-US"/>
         </w:rPr>
         <w:t>&lt;tbody&gt;</w:t>
       </w:r>
@@ -2196,7 +1932,6 @@
       <w:r>
         <w:rPr>
           <w:rtl w:val="0"/>
-          <w:lang w:val="en-US"/>
         </w:rPr>
         <w:t>&lt;tr&gt;</w:t>
       </w:r>
@@ -2208,7 +1943,6 @@
       <w:r>
         <w:rPr>
           <w:rtl w:val="0"/>
-          <w:lang w:val="en-US"/>
         </w:rPr>
         <w:t>&lt;th&gt;Parameter&lt;/th&gt;</w:t>
       </w:r>
@@ -2220,7 +1954,6 @@
       <w:r>
         <w:rPr>
           <w:rtl w:val="0"/>
-          <w:lang w:val="en-US"/>
         </w:rPr>
         <w:t>&lt;th&gt;Value&lt;/th&gt;</w:t>
       </w:r>
@@ -2232,7 +1965,6 @@
       <w:r>
         <w:rPr>
           <w:rtl w:val="0"/>
-          <w:lang w:val="en-US"/>
         </w:rPr>
         <w:t>&lt;/tr&gt;</w:t>
       </w:r>
@@ -2244,7 +1976,6 @@
       <w:r>
         <w:rPr>
           <w:rtl w:val="0"/>
-          <w:lang w:val="en-US"/>
         </w:rPr>
         <w:t>&lt;tr&gt;</w:t>
       </w:r>
@@ -2256,7 +1987,6 @@
       <w:r>
         <w:rPr>
           <w:rtl w:val="0"/>
-          <w:lang w:val="en-US"/>
         </w:rPr>
         <w:t>&lt;td&gt;Type&lt;/td&gt;</w:t>
       </w:r>
@@ -2268,7 +1998,6 @@
       <w:r>
         <w:rPr>
           <w:rtl w:val="0"/>
-          <w:lang w:val="en-US"/>
         </w:rPr>
         <w:t>&lt;td&gt;{typ_produktu}&lt;/td&gt;</w:t>
       </w:r>
@@ -2280,7 +2009,6 @@
       <w:r>
         <w:rPr>
           <w:rtl w:val="0"/>
-          <w:lang w:val="en-US"/>
         </w:rPr>
         <w:t>&lt;/tr&gt;</w:t>
       </w:r>
@@ -2292,7 +2020,6 @@
       <w:r>
         <w:rPr>
           <w:rtl w:val="0"/>
-          <w:lang w:val="en-US"/>
         </w:rPr>
         <w:t>&lt;tr&gt;</w:t>
       </w:r>
@@ -2304,7 +2031,6 @@
       <w:r>
         <w:rPr>
           <w:rtl w:val="0"/>
-          <w:lang w:val="en-US"/>
         </w:rPr>
         <w:t>&lt;td&gt;Manufacturer&lt;/td&gt;</w:t>
       </w:r>
@@ -2316,7 +2042,6 @@
       <w:r>
         <w:rPr>
           <w:rtl w:val="0"/>
-          <w:lang w:val="en-US"/>
         </w:rPr>
         <w:t>&lt;td&gt;{vyrobce}&lt;/td&gt;</w:t>
       </w:r>
@@ -2328,7 +2053,6 @@
       <w:r>
         <w:rPr>
           <w:rtl w:val="0"/>
-          <w:lang w:val="en-US"/>
         </w:rPr>
         <w:t>&lt;/tr&gt;</w:t>
       </w:r>
@@ -2340,7 +2064,6 @@
       <w:r>
         <w:rPr>
           <w:rtl w:val="0"/>
-          <w:lang w:val="en-US"/>
         </w:rPr>
         <w:t>&lt;tr&gt;</w:t>
       </w:r>
@@ -2352,7 +2075,6 @@
       <w:r>
         <w:rPr>
           <w:rtl w:val="0"/>
-          <w:lang w:val="en-US"/>
         </w:rPr>
         <w:t>&lt;td&gt;Volume / Size&lt;/td&gt;</w:t>
       </w:r>
@@ -2364,7 +2086,6 @@
       <w:r>
         <w:rPr>
           <w:rtl w:val="0"/>
-          <w:lang w:val="en-US"/>
         </w:rPr>
         <w:t>&lt;td&gt;{objem_rozmer}&lt;/td&gt;</w:t>
       </w:r>
@@ -2376,7 +2097,6 @@
       <w:r>
         <w:rPr>
           <w:rtl w:val="0"/>
-          <w:lang w:val="en-US"/>
         </w:rPr>
         <w:t>&lt;/tr&gt;</w:t>
       </w:r>
@@ -2388,7 +2108,6 @@
       <w:r>
         <w:rPr>
           <w:rtl w:val="0"/>
-          <w:lang w:val="en-US"/>
         </w:rPr>
         <w:t>&lt;tr&gt;</w:t>
       </w:r>
@@ -2400,7 +2119,6 @@
       <w:r>
         <w:rPr>
           <w:rtl w:val="0"/>
-          <w:lang w:val="en-US"/>
         </w:rPr>
         <w:t>&lt;td&gt;Suitable for&lt;/td&gt;</w:t>
       </w:r>
@@ -2412,7 +2130,6 @@
       <w:r>
         <w:rPr>
           <w:rtl w:val="0"/>
-          <w:lang w:val="en-US"/>
         </w:rPr>
         <w:t>&lt;td&gt;{vhodne_pro}&lt;/td&gt;</w:t>
       </w:r>
@@ -2424,7 +2141,6 @@
       <w:r>
         <w:rPr>
           <w:rtl w:val="0"/>
-          <w:lang w:val="en-US"/>
         </w:rPr>
         <w:t>&lt;/tr&gt;</w:t>
       </w:r>
@@ -2436,7 +2152,6 @@
       <w:r>
         <w:rPr>
           <w:rtl w:val="0"/>
-          <w:lang w:val="en-US"/>
         </w:rPr>
         <w:t>&lt;tr&gt;</w:t>
       </w:r>
@@ -2448,7 +2163,6 @@
       <w:r>
         <w:rPr>
           <w:rtl w:val="0"/>
-          <w:lang w:val="en-US"/>
         </w:rPr>
         <w:t>&lt;td&gt;Special features&lt;/td&gt;</w:t>
       </w:r>
@@ -2460,7 +2174,6 @@
       <w:r>
         <w:rPr>
           <w:rtl w:val="0"/>
-          <w:lang w:val="en-US"/>
         </w:rPr>
         <w:t>&lt;td&gt;{specialni_vlastnosti}&lt;/td&gt;</w:t>
       </w:r>
@@ -2472,7 +2185,6 @@
       <w:r>
         <w:rPr>
           <w:rtl w:val="0"/>
-          <w:lang w:val="en-US"/>
         </w:rPr>
         <w:t>&lt;/tr&gt;</w:t>
       </w:r>
@@ -2484,7 +2196,6 @@
       <w:r>
         <w:rPr>
           <w:rtl w:val="0"/>
-          <w:lang w:val="en-US"/>
         </w:rPr>
         <w:t>&lt;/tbody&gt;</w:t>
       </w:r>
@@ -2496,7 +2207,6 @@
       <w:r>
         <w:rPr>
           <w:rtl w:val="0"/>
-          <w:lang w:val="en-US"/>
         </w:rPr>
         <w:t>&lt;/table&gt;</w:t>
       </w:r>
@@ -2508,7 +2218,6 @@
       <w:r>
         <w:rPr>
           <w:rtl w:val="0"/>
-          <w:lang w:val="en-US"/>
         </w:rPr>
         <w:t>&lt;/div&gt;</w:t>
       </w:r>
@@ -2520,7 +2229,6 @@
       <w:r>
         <w:rPr>
           <w:rtl w:val="0"/>
-          <w:lang w:val="en-US"/>
         </w:rPr>
         <w:t>&lt;/div&gt;</w:t>
       </w:r>
@@ -2537,19 +2245,17 @@
       <w:r>
         <w:rPr>
           <w:rtl w:val="0"/>
-          <w:lang w:val="en-US"/>
-        </w:rPr>
-        <w:t>&lt;!-- TIPS &amp; TRICKS --&gt;</w:t>
-      </w:r>
-    </w:p>
-    <w:p>
-      <w:pPr>
-        <w:pStyle w:val="Text A"/>
-      </w:pPr>
-      <w:r>
-        <w:rPr>
-          <w:rtl w:val="0"/>
-          <w:lang w:val="en-US"/>
+        </w:rPr>
+        <w:t>&lt;!-- TIPS AND TRICKS --&gt;</w:t>
+      </w:r>
+    </w:p>
+    <w:p>
+      <w:pPr>
+        <w:pStyle w:val="Text A"/>
+      </w:pPr>
+      <w:r>
+        <w:rPr>
+          <w:rtl w:val="0"/>
         </w:rPr>
         <w:t>&lt;div class="section"&gt;</w:t>
       </w:r>
@@ -2561,19 +2267,17 @@
       <w:r>
         <w:rPr>
           <w:rtl w:val="0"/>
-          <w:lang w:val="en-US"/>
-        </w:rPr>
-        <w:t>&lt;h2&gt;Tips &amp; tricks&lt;/h2&gt;</w:t>
-      </w:r>
-    </w:p>
-    <w:p>
-      <w:pPr>
-        <w:pStyle w:val="Text A"/>
-      </w:pPr>
-      <w:r>
-        <w:rPr>
-          <w:rtl w:val="0"/>
-          <w:lang w:val="en-US"/>
+        </w:rPr>
+        <w:t>&lt;h2&gt;Tips and tricks&lt;/h2&gt;</w:t>
+      </w:r>
+    </w:p>
+    <w:p>
+      <w:pPr>
+        <w:pStyle w:val="Text A"/>
+      </w:pPr>
+      <w:r>
+        <w:rPr>
+          <w:rtl w:val="0"/>
         </w:rPr>
         <w:t>&lt;div class="card-table"&gt;</w:t>
       </w:r>
@@ -2585,7 +2289,6 @@
       <w:r>
         <w:rPr>
           <w:rtl w:val="0"/>
-          <w:lang w:val="en-US"/>
         </w:rPr>
         <w:t>&lt;table&gt;</w:t>
       </w:r>
@@ -2597,7 +2300,6 @@
       <w:r>
         <w:rPr>
           <w:rtl w:val="0"/>
-          <w:lang w:val="en-US"/>
         </w:rPr>
         <w:t>&lt;tbody&gt;</w:t>
       </w:r>
@@ -2609,7 +2311,6 @@
       <w:r>
         <w:rPr>
           <w:rtl w:val="0"/>
-          <w:lang w:val="en-US"/>
         </w:rPr>
         <w:t>&lt;tr&gt;</w:t>
       </w:r>
@@ -2621,7 +2322,6 @@
       <w:r>
         <w:rPr>
           <w:rtl w:val="0"/>
-          <w:lang w:val="en-US"/>
         </w:rPr>
         <w:t>&lt;th&gt;Category&lt;/th&gt;</w:t>
       </w:r>
@@ -2633,7 +2333,6 @@
       <w:r>
         <w:rPr>
           <w:rtl w:val="0"/>
-          <w:lang w:val="en-US"/>
         </w:rPr>
         <w:t>&lt;th&gt;Description&lt;/th&gt;</w:t>
       </w:r>
@@ -2645,7 +2344,6 @@
       <w:r>
         <w:rPr>
           <w:rtl w:val="0"/>
-          <w:lang w:val="en-US"/>
         </w:rPr>
         <w:t>&lt;/tr&gt;</w:t>
       </w:r>
@@ -2657,7 +2355,6 @@
       <w:r>
         <w:rPr>
           <w:rtl w:val="0"/>
-          <w:lang w:val="en-US"/>
         </w:rPr>
         <w:t>&lt;tr&gt;</w:t>
       </w:r>
@@ -2669,45 +2366,28 @@
       <w:r>
         <w:rPr>
           <w:rtl w:val="0"/>
-          <w:lang w:val="en-US"/>
-        </w:rPr>
-        <w:t>&lt;td&gt;Usage&lt;/td&gt;</w:t>
-      </w:r>
-    </w:p>
-    <w:p>
-      <w:pPr>
-        <w:pStyle w:val="Text A"/>
-      </w:pPr>
-      <w:r>
-        <w:rPr>
-          <w:rtl w:val="0"/>
-          <w:lang w:val="en-US"/>
-        </w:rPr>
-        <w:t>&lt;td&gt;{doporucene</w:t>
-      </w:r>
-      <w:r>
-        <w:rPr>
-          <w:rtl w:val="0"/>
-          <w:lang w:val="fr-FR"/>
-        </w:rPr>
-        <w:t>_pouz</w:t>
-      </w:r>
-      <w:r>
-        <w:rPr>
-          <w:rtl w:val="0"/>
-          <w:lang w:val="en-US"/>
-        </w:rPr>
-        <w:t>iti_tabulka}&lt;/td&gt;</w:t>
-      </w:r>
-    </w:p>
-    <w:p>
-      <w:pPr>
-        <w:pStyle w:val="Text A"/>
-      </w:pPr>
-      <w:r>
-        <w:rPr>
-          <w:rtl w:val="0"/>
-          <w:lang w:val="en-US"/>
+        </w:rPr>
+        <w:t>&lt;td&gt;Use&lt;/td&gt;</w:t>
+      </w:r>
+    </w:p>
+    <w:p>
+      <w:pPr>
+        <w:pStyle w:val="Text A"/>
+      </w:pPr>
+      <w:r>
+        <w:rPr>
+          <w:rtl w:val="0"/>
+        </w:rPr>
+        <w:t>&lt;td&gt;{doporucene_pouziti_tabulka}&lt;/td&gt;</w:t>
+      </w:r>
+    </w:p>
+    <w:p>
+      <w:pPr>
+        <w:pStyle w:val="Text A"/>
+      </w:pPr>
+      <w:r>
+        <w:rPr>
+          <w:rtl w:val="0"/>
         </w:rPr>
         <w:t>&lt;/tr&gt;</w:t>
       </w:r>
@@ -2719,7 +2399,6 @@
       <w:r>
         <w:rPr>
           <w:rtl w:val="0"/>
-          <w:lang w:val="en-US"/>
         </w:rPr>
         <w:t>&lt;tr&gt;</w:t>
       </w:r>
@@ -2731,7 +2410,6 @@
       <w:r>
         <w:rPr>
           <w:rtl w:val="0"/>
-          <w:lang w:val="en-US"/>
         </w:rPr>
         <w:t>&lt;td&gt;Advantages&lt;/td&gt;</w:t>
       </w:r>
@@ -2743,7 +2421,6 @@
       <w:r>
         <w:rPr>
           <w:rtl w:val="0"/>
-          <w:lang w:val="en-US"/>
         </w:rPr>
         <w:t>&lt;td&gt;{vyhody}&lt;/td&gt;</w:t>
       </w:r>
@@ -2755,7 +2432,6 @@
       <w:r>
         <w:rPr>
           <w:rtl w:val="0"/>
-          <w:lang w:val="en-US"/>
         </w:rPr>
         <w:t>&lt;/tr&gt;</w:t>
       </w:r>
@@ -2767,7 +2443,6 @@
       <w:r>
         <w:rPr>
           <w:rtl w:val="0"/>
-          <w:lang w:val="en-US"/>
         </w:rPr>
         <w:t>&lt;tr&gt;</w:t>
       </w:r>
@@ -2779,7 +2454,6 @@
       <w:r>
         <w:rPr>
           <w:rtl w:val="0"/>
-          <w:lang w:val="en-US"/>
         </w:rPr>
         <w:t>&lt;td&gt;Weaknesses&lt;/td&gt;</w:t>
       </w:r>
@@ -2791,7 +2465,6 @@
       <w:r>
         <w:rPr>
           <w:rtl w:val="0"/>
-          <w:lang w:val="en-US"/>
         </w:rPr>
         <w:t>&lt;td&gt;{slabiny}&lt;/td&gt;</w:t>
       </w:r>
@@ -2803,7 +2476,6 @@
       <w:r>
         <w:rPr>
           <w:rtl w:val="0"/>
-          <w:lang w:val="en-US"/>
         </w:rPr>
         <w:t>&lt;/tr&gt;</w:t>
       </w:r>
@@ -2815,7 +2487,6 @@
       <w:r>
         <w:rPr>
           <w:rtl w:val="0"/>
-          <w:lang w:val="en-US"/>
         </w:rPr>
         <w:t>&lt;tr&gt;</w:t>
       </w:r>
@@ -2827,7 +2498,6 @@
       <w:r>
         <w:rPr>
           <w:rtl w:val="0"/>
-          <w:lang w:val="en-US"/>
         </w:rPr>
         <w:t>&lt;td&gt;Combination&lt;/td&gt;</w:t>
       </w:r>
@@ -2839,7 +2509,6 @@
       <w:r>
         <w:rPr>
           <w:rtl w:val="0"/>
-          <w:lang w:val="en-US"/>
         </w:rPr>
         <w:t>&lt;td&gt;{doporucene_kombinace}&lt;/td&gt;</w:t>
       </w:r>
@@ -2851,7 +2520,6 @@
       <w:r>
         <w:rPr>
           <w:rtl w:val="0"/>
-          <w:lang w:val="en-US"/>
         </w:rPr>
         <w:t>&lt;/tr&gt;</w:t>
       </w:r>
@@ -2863,7 +2531,6 @@
       <w:r>
         <w:rPr>
           <w:rtl w:val="0"/>
-          <w:lang w:val="en-US"/>
         </w:rPr>
         <w:t>&lt;tr&gt;</w:t>
       </w:r>
@@ -2875,7 +2542,6 @@
       <w:r>
         <w:rPr>
           <w:rtl w:val="0"/>
-          <w:lang w:val="en-US"/>
         </w:rPr>
         <w:t>&lt;td&gt;Tip&lt;/td&gt;</w:t>
       </w:r>
@@ -2887,7 +2553,6 @@
       <w:r>
         <w:rPr>
           <w:rtl w:val="0"/>
-          <w:lang w:val="en-US"/>
         </w:rPr>
         <w:t>&lt;td&gt;{prakticky_tip}&lt;/td&gt;</w:t>
       </w:r>
@@ -2899,7 +2564,6 @@
       <w:r>
         <w:rPr>
           <w:rtl w:val="0"/>
-          <w:lang w:val="en-US"/>
         </w:rPr>
         <w:t>&lt;/tr&gt;</w:t>
       </w:r>
@@ -2911,7 +2575,6 @@
       <w:r>
         <w:rPr>
           <w:rtl w:val="0"/>
-          <w:lang w:val="en-US"/>
         </w:rPr>
         <w:t>&lt;/tbody&gt;</w:t>
       </w:r>
@@ -2923,7 +2586,6 @@
       <w:r>
         <w:rPr>
           <w:rtl w:val="0"/>
-          <w:lang w:val="en-US"/>
         </w:rPr>
         <w:t>&lt;/table&gt;</w:t>
       </w:r>
@@ -2935,7 +2597,6 @@
       <w:r>
         <w:rPr>
           <w:rtl w:val="0"/>
-          <w:lang w:val="en-US"/>
         </w:rPr>
         <w:t>&lt;/div&gt;</w:t>
       </w:r>
@@ -2947,7 +2608,6 @@
       <w:r>
         <w:rPr>
           <w:rtl w:val="0"/>
-          <w:lang w:val="en-US"/>
         </w:rPr>
         <w:t>&lt;/div&gt;</w:t>
       </w:r>
@@ -2964,7 +2624,6 @@
       <w:r>
         <w:rPr>
           <w:rtl w:val="0"/>
-          <w:lang w:val="en-US"/>
         </w:rPr>
         <w:t>&lt;!-- PACKAGE CONTENTS --&gt;</w:t>
       </w:r>
@@ -2976,7 +2635,6 @@
       <w:r>
         <w:rPr>
           <w:rtl w:val="0"/>
-          <w:lang w:val="en-US"/>
         </w:rPr>
         <w:t>&lt;div class="section"&gt;</w:t>
       </w:r>
@@ -2988,7 +2646,6 @@
       <w:r>
         <w:rPr>
           <w:rtl w:val="0"/>
-          <w:lang w:val="en-US"/>
         </w:rPr>
         <w:t>&lt;h2&gt;Package contents&lt;/h2&gt;</w:t>
       </w:r>
@@ -3000,7 +2657,6 @@
       <w:r>
         <w:rPr>
           <w:rtl w:val="0"/>
-          <w:lang w:val="en-US"/>
         </w:rPr>
         <w:t>&lt;div class="card-table"&gt;</w:t>
       </w:r>
@@ -3012,7 +2668,6 @@
       <w:r>
         <w:rPr>
           <w:rtl w:val="0"/>
-          <w:lang w:val="en-US"/>
         </w:rPr>
         <w:t>&lt;table&gt;</w:t>
       </w:r>
@@ -3024,7 +2679,6 @@
       <w:r>
         <w:rPr>
           <w:rtl w:val="0"/>
-          <w:lang w:val="en-US"/>
         </w:rPr>
         <w:t>&lt;tbody&gt;</w:t>
       </w:r>
@@ -3036,7 +2690,6 @@
       <w:r>
         <w:rPr>
           <w:rtl w:val="0"/>
-          <w:lang w:val="en-US"/>
         </w:rPr>
         <w:t>&lt;tr&gt;</w:t>
       </w:r>
@@ -3048,7 +2701,6 @@
       <w:r>
         <w:rPr>
           <w:rtl w:val="0"/>
-          <w:lang w:val="en-US"/>
         </w:rPr>
         <w:t>&lt;th&gt;Category&lt;/th&gt;</w:t>
       </w:r>
@@ -3060,19 +2712,17 @@
       <w:r>
         <w:rPr>
           <w:rtl w:val="0"/>
-          <w:lang w:val="en-US"/>
-        </w:rPr>
-        <w:t>&lt;th&gt;Content&lt;/th&gt;</w:t>
-      </w:r>
-    </w:p>
-    <w:p>
-      <w:pPr>
-        <w:pStyle w:val="Text A"/>
-      </w:pPr>
-      <w:r>
-        <w:rPr>
-          <w:rtl w:val="0"/>
-          <w:lang w:val="en-US"/>
+        </w:rPr>
+        <w:t>&lt;th&gt;Contents&lt;/th&gt;</w:t>
+      </w:r>
+    </w:p>
+    <w:p>
+      <w:pPr>
+        <w:pStyle w:val="Text A"/>
+      </w:pPr>
+      <w:r>
+        <w:rPr>
+          <w:rtl w:val="0"/>
         </w:rPr>
         <w:t>&lt;/tr&gt;</w:t>
       </w:r>
@@ -3084,7 +2734,6 @@
       <w:r>
         <w:rPr>
           <w:rtl w:val="0"/>
-          <w:lang w:val="en-US"/>
         </w:rPr>
         <w:t>&lt;tr&gt;</w:t>
       </w:r>
@@ -3096,7 +2745,6 @@
       <w:r>
         <w:rPr>
           <w:rtl w:val="0"/>
-          <w:lang w:val="en-US"/>
         </w:rPr>
         <w:t>&lt;td&gt;Product&lt;/td&gt;</w:t>
       </w:r>
@@ -3108,7 +2756,6 @@
       <w:r>
         <w:rPr>
           <w:rtl w:val="0"/>
-          <w:lang w:val="en-US"/>
         </w:rPr>
         <w:t>&lt;td&gt;{obsah_produktu}&lt;/td&gt;</w:t>
       </w:r>
@@ -3120,7 +2767,6 @@
       <w:r>
         <w:rPr>
           <w:rtl w:val="0"/>
-          <w:lang w:val="en-US"/>
         </w:rPr>
         <w:t>&lt;/tr&gt;</w:t>
       </w:r>
@@ -3132,7 +2778,6 @@
       <w:r>
         <w:rPr>
           <w:rtl w:val="0"/>
-          <w:lang w:val="en-US"/>
         </w:rPr>
         <w:t>&lt;tr&gt;</w:t>
       </w:r>
@@ -3144,7 +2789,6 @@
       <w:r>
         <w:rPr>
           <w:rtl w:val="0"/>
-          <w:lang w:val="en-US"/>
         </w:rPr>
         <w:t>&lt;td&gt;Accessories&lt;/td&gt;</w:t>
       </w:r>
@@ -3156,7 +2800,6 @@
       <w:r>
         <w:rPr>
           <w:rtl w:val="0"/>
-          <w:lang w:val="en-US"/>
         </w:rPr>
         <w:t>&lt;td&gt;{doporucene_prislusenstvi}&lt;/td&gt;</w:t>
       </w:r>
@@ -3168,7 +2811,6 @@
       <w:r>
         <w:rPr>
           <w:rtl w:val="0"/>
-          <w:lang w:val="en-US"/>
         </w:rPr>
         <w:t>&lt;/tr&gt;</w:t>
       </w:r>
@@ -3180,7 +2822,6 @@
       <w:r>
         <w:rPr>
           <w:rtl w:val="0"/>
-          <w:lang w:val="en-US"/>
         </w:rPr>
         <w:t>&lt;/tbody&gt;</w:t>
       </w:r>
@@ -3192,7 +2833,6 @@
       <w:r>
         <w:rPr>
           <w:rtl w:val="0"/>
-          <w:lang w:val="en-US"/>
         </w:rPr>
         <w:t>&lt;/table&gt;</w:t>
       </w:r>
@@ -3204,7 +2844,6 @@
       <w:r>
         <w:rPr>
           <w:rtl w:val="0"/>
-          <w:lang w:val="en-US"/>
         </w:rPr>
         <w:t>&lt;/div&gt;</w:t>
       </w:r>
@@ -3216,7 +2855,6 @@
       <w:r>
         <w:rPr>
           <w:rtl w:val="0"/>
-          <w:lang w:val="en-US"/>
         </w:rPr>
         <w:t>&lt;!-- SHADE DISCLAIMER --&gt;</w:t>
       </w:r>
@@ -3228,7 +2866,6 @@
       <w:r>
         <w:rPr>
           <w:rtl w:val="0"/>
-          <w:lang w:val="en-US"/>
         </w:rPr>
         <w:t>&lt;div class="section notice"&gt;</w:t>
       </w:r>
@@ -3240,19 +2877,17 @@
       <w:r>
         <w:rPr>
           <w:rtl w:val="0"/>
-          <w:lang w:val="en-US"/>
-        </w:rPr>
-        <w:t xml:space="preserve">  &lt;p&gt;&lt;strong&gt;Notice:&lt;/strong&gt; Colors displayed on your monitor may differ slightly from the actual paint shade in real life. This depends on the brightness, contrast, and color profile settings of your device. For the most accurate impression, we recommend testing the paint on a sample model or taking inspiration from community showcases.&lt;/p&gt;</w:t>
-      </w:r>
-    </w:p>
-    <w:p>
-      <w:pPr>
-        <w:pStyle w:val="Text A"/>
-      </w:pPr>
-      <w:r>
-        <w:rPr>
-          <w:rtl w:val="0"/>
-          <w:lang w:val="en-US"/>
+        </w:rPr>
+        <w:t xml:space="preserve">  &lt;p&gt;&lt;strong&gt;Notice:&lt;/strong&gt; Colours displayed on your monitor may differ slightly from the actual real-life shade. This depends on the brightness, contrast, and colour profile settings of your device. For the most accurate impression, we recommend testing the paint on a sample model or taking inspiration from community showcases.&lt;/p&gt;</w:t>
+      </w:r>
+    </w:p>
+    <w:p>
+      <w:pPr>
+        <w:pStyle w:val="Text A"/>
+      </w:pPr>
+      <w:r>
+        <w:rPr>
+          <w:rtl w:val="0"/>
         </w:rPr>
         <w:t>&lt;/div&gt;</w:t>
       </w:r>
@@ -3264,7 +2899,6 @@
       <w:r>
         <w:rPr>
           <w:rtl w:val="0"/>
-          <w:lang w:val="en-US"/>
         </w:rPr>
         <w:t>&lt;/div&gt;</w:t>
       </w:r>

</xml_diff>